<commit_message>
Record merged review in report and README
</commit_message>
<xml_diff>
--- a/backend/REPORT_CCNLTHD_NHOM_9_CAP_NHAT_20261020.docx
+++ b/backend/REPORT_CCNLTHD_NHOM_9_CAP_NHAT_20261020.docx
@@ -35,7 +35,7 @@
         <w:spacing w:after="120"/>
       </w:pPr>
       <w:r>
-        <w:t xml:space="preserve">Kết quả rubric: 22/23 tiêu chí đạt. A1, F1–F6, C1.1–C1.3, C2.1–C2.2, C4, D2–D8 và E1–E2 có bằng chứng tương ứng. D1 Git workflow còn đạt một phần: PR #12 đang Draft, chưa có reviewer phê duyệt và chưa merge vào main.</w:t>
+        <w:t xml:space="preserve">Kết quả rubric: 23/23 tiêu chí đạt theo bằng chứng audit, chưa phải điểm chính thức của giảng viên. A1, F1–F6, C1.1–C1.3, C2.1–C2.2, C4, D1–D8 và E1–E2 có bằng chứng tương ứng. PR #12 được vennnguyen phê duyệt trên SHA bb7593c, CI qua và merge vào main ngày 20/10/2026.</w:t>
       </w:r>
     </w:p>
     <w:p xmlns:w="http://schemas.openxmlformats.org/wordprocessingml/2006/main">
@@ -62,7 +62,7 @@
         <w:spacing w:after="120"/>
       </w:pPr>
       <w:r>
-        <w:t xml:space="preserve">Giới hạn còn lại: Chưa có review chéo thật trên PR; chưa pentest độc lập. Outbox giao nhận ít nhất một lần; dead-letter queue cần người vận hành xem và replay. BookSearchSync theo dõi thay đổi qua API; mất toàn bộ index hoặc sửa dữ liệu ngoài API cần chạy search-reindex. Migration BookSearchSync chưa áp lên database mặc định của người dùng.</w:t>
+        <w:t xml:space="preserve">Giới hạn còn lại: Chưa pentest độc lập. Outbox giao nhận ít nhất một lần; dead-letter queue cần người vận hành xem và replay. BookSearchSync theo dõi thay đổi qua API; mất toàn bộ index hoặc sửa dữ liệu ngoài API cần chạy search-reindex. Migration BookSearchSync chưa áp lên database mặc định của người dùng.</w:t>
       </w:r>
     </w:p>
     <w:p xmlns:w="http://schemas.openxmlformats.org/wordprocessingml/2006/main">
@@ -71,7 +71,7 @@
         <w:spacing w:after="120"/>
       </w:pPr>
       <w:r>
-        <w:t xml:space="preserve">Bằng chứng chi tiết: backend/docs/evidence/rubric-followup-20261020.md; PR #12: https://github.com/Thuat3Tuoi/book_selling_system/pull/12; CI PR: https://github.com/Thuat3Tuoi/book_selling_system/actions/runs/39351215489. Số liệu này gắn với SHA và môi trường audit nêu trên, chưa phải kết quả của main sau merge.</w:t>
+        <w:t xml:space="preserve">Bằng chứng chi tiết: backend/docs/evidence/rubric-followup-20261020.md; PR #12: https://github.com/Thuat3Tuoi/book_selling_system/pull/12; CI PR: https://github.com/Thuat3Tuoi/book_selling_system/actions/runs/39351215489. Số liệu kiểm thử gắn với SHA bb7593c và môi trường audit; mã đã merge vào main, còn database mặc định chưa được migrate.</w:t>
       </w:r>
     </w:p>
     <w:p>
@@ -40546,7 +40546,7 @@
         <w:spacing w:after="120"/>
       </w:pPr>
       <w:r>
-        <w:t xml:space="preserve">CẬP NHẬT 20/10/2026: Rubric bản hiện tại đạt 22/23 tiêu chí. D1 Git workflow còn một phần: PR #12 Draft, chưa review chéo và chưa merge. Chưa có pentest độc lập; kết quả E2E, outage và EXPLAIN chỉ đại diện môi trường audit. Nội dung 50/50 test và frontend lỗi phía dưới là mốc lịch sử 16/10.</w:t>
+        <w:t xml:space="preserve">CẬP NHẬT 20/10/2026: Rubric bản hiện tại đạt 23/23 tiêu chí theo bằng chứng audit. D1 Git workflow đã có review chéo của vennnguyen trên SHA chốt, CI thành công và merge vào main. Chưa có pentest độc lập; E2E, outage và EXPLAIN chỉ đại diện môi trường audit. Nội dung 50/50 test và frontend lỗi phía dưới là mốc lịch sử 16/10.</w:t>
       </w:r>
     </w:p>
     <w:p>

</xml_diff>

<commit_message>
add docker and docker compose configuration
</commit_message>
<xml_diff>
--- a/backend/REPORT_CCNLTHD_NHOM_9_CAP_NHAT_20261020.docx
+++ b/backend/REPORT_CCNLTHD_NHOM_9_CAP_NHAT_20261020.docx
@@ -27,7 +27,7 @@
         <w:jc w:val="center"/>
       </w:pPr>
       <w:r>
-        <w:t xml:space="preserve">Nhóm 9 | Bản đối chiếu cấu trúc và minh chứng ngày 20/10/2026</w:t>
+        <w:t xml:space="preserve">Nhóm 9 | Hướng dẫn triển khai, thực hành và kiểm tra kết quả — 20/10/2026</w:t>
       </w:r>
     </w:p>
     <w:p>
@@ -54,7 +54,7 @@
         <w:jc w:val="center"/>
       </w:pPr>
       <w:r>
-        <w:t xml:space="preserve">Thông tin giảng viên, lớp, MSSV và thành viên: chưa có nguồn xác nhận trong tài liệu hiện có; nhóm cần bổ sung khi nộp.</w:t>
+        <w:t xml:space="preserve">Trước khi nộp, điền thông tin giảng viên, lớp, MSSV và thành viên theo danh sách nhóm đã được xác nhận.</w:t>
       </w:r>
     </w:p>
     <w:p>
@@ -68,7 +68,7 @@
         <w:spacing w:after="120"/>
       </w:pPr>
       <w:r>
-        <w:t xml:space="preserve">BẢN CẬP NHẬT KIỂM CHỨNG — 20/10/2026</w:t>
+        <w:t xml:space="preserve">HƯỚNG DẪN ĐỌC VÀ KIỂM CHỨNG — 20/10/2026</w:t>
       </w:r>
     </w:p>
     <w:p xmlns:w="http://schemas.openxmlformats.org/wordprocessingml/2006/main">
@@ -77,7 +77,7 @@
         <w:spacing w:after="120"/>
       </w:pPr>
       <w:r>
-        <w:t xml:space="preserve">Phạm vi và nguyên tắc đối chiếu</w:t>
+        <w:t xml:space="preserve">Cách sử dụng báo cáo và nguồn kiểm tra</w:t>
       </w:r>
     </w:p>
     <w:p xmlns:w="http://schemas.openxmlformats.org/wordprocessingml/2006/main">
@@ -86,7 +86,7 @@
         <w:spacing w:after="120"/>
       </w:pPr>
       <w:r>
-        <w:t xml:space="preserve">Báo cáo này đối chiếu mã nguồn tại commit bb7593cd5ade583d851144ffbec2f745ad9427cf (PR #12, đã merge vào main) với cấu trúc báo cáo của học phần. Những kết quả ngày 16/10/2026 chỉ là mốc lịch sử; từ Chương 5 trở đi trình bày trạng thái được kiểm chứng ngày 19–20/10/2026. Không có nhận xét tuần 5 của nhóm 9 trong file chuẩn, nên không gán nhãn đã sửa góp ý cũ.</w:t>
+        <w:t xml:space="preserve">Đọc Chương 1–4 để nắm công nghệ và cấu trúc dự án; thực hiện các bước ở Chương 5–12 để kiểm tra chức năng và kết quả. Dùng mã nguồn tại commit bb7593cd5ade583d851144ffbec2f745ad9427cf (PR #12, đã merge vào main) làm mốc đối chiếu. Các số liệu ngày 16/10/2026 là mốc lịch sử; kết quả từ Chương 5 trở đi thuộc lượt kiểm chứng ngày 19–20/10/2026.</w:t>
       </w:r>
     </w:p>
     <w:p xmlns:w="http://schemas.openxmlformats.org/wordprocessingml/2006/main">
@@ -95,7 +95,7 @@
         <w:spacing w:after="120"/>
       </w:pPr>
       <w:r>
-        <w:t xml:space="preserve">Bảng audit kỹ thuật hiện đánh dấu 23/23 tiêu chí có bằng chứng tại SHA bb7593c; đây là kết quả tự đối chiếu, không phải điểm chính thức. PR #12 được vennnguyen review trên chính SHA, hai job CI thành công và merge vào main ngày 20/10/2026.</w:t>
+        <w:t xml:space="preserve">Khi đối chiếu bảng kỹ thuật, mở từng file và bằng chứng tại SHA bb7593c; bảng ghi 23/23 tiêu chí có minh chứng nhưng không thay thế kết quả chấm chính thức. Kiểm tra PR #12 để xem review trên SHA này, hai job CI thành công và lần merge vào main ngày 20/10/2026.</w:t>
       </w:r>
     </w:p>
     <w:p xmlns:w="http://schemas.openxmlformats.org/wordprocessingml/2006/main">
@@ -104,7 +104,7 @@
         <w:spacing w:after="120"/>
       </w:pPr>
       <w:r>
-        <w:t xml:space="preserve">Kiểm chứng ngày 20/10: backend lint/build, Prisma validate và 191/191 unit/API test đạt; frontend build đạt; 15/15 E2E trên Compose và database audit riêng, áp 10/10 migration trên database audit. CI chạy backend test và frontend build; E2E chạy riêng. Image clone sạch và image Compose có cùng RootFS layer/history; digest config khác do nhãn Compose.</w:t>
+        <w:t xml:space="preserve">Để kiểm tra bản mã, chạy backend lint/build, Prisma validate, unit/API test và frontend build; kết quả tham chiếu là 191/191 unit/API test đạt. Chạy E2E trên Compose và database audit riêng để đối chiếu 15/15 ca cùng 10/10 migration. Kiểm tra RootFS layer/history khi so sánh image clone sạch với image Compose; digest config có thể khác do nhãn Compose.</w:t>
       </w:r>
     </w:p>
     <w:p xmlns:w="http://schemas.openxmlformats.org/wordprocessingml/2006/main">
@@ -113,7 +113,7 @@
         <w:spacing w:after="120"/>
       </w:pPr>
       <w:r>
-        <w:t xml:space="preserve">Đã kiểm tra ownership/RBAC bằng hai customer và staff; ValidationPipe thật trên POST /books; outbox RabbitMQ, consumer idempotency, dead-letter queue; cron đúng múi giờ; Redis invalidation và hồi phục; BookSearchSync retry sau gián đoạn Meilisearch. Role, loại thông báo và trạng thái nghiệp vụ được khai báo bằng enum.</w:t>
+        <w:t xml:space="preserve">Kiểm tra ownership/RBAC bằng hai customer và một staff; gửi request sai và đúng đến POST /books để xác nhận ValidationPipe. Sau đó kiểm tra outbox RabbitMQ, consumer idempotency, dead-letter queue, cron theo múi giờ, Redis invalidation và BookSearchSync khi Meilisearch gián đoạn. Đối chiếu role, loại thông báo và trạng thái trong Prisma enum.</w:t>
       </w:r>
     </w:p>
     <w:p xmlns:w="http://schemas.openxmlformats.org/wordprocessingml/2006/main">
@@ -122,7 +122,7 @@
         <w:spacing w:after="120"/>
       </w:pPr>
       <w:r>
-        <w:t xml:space="preserve">Giới hạn: chưa pentest độc lập; outbox bảo đảm giao nhận ít nhất một lần và DLQ cần xử lý vận hành; đồng bộ search qua API có retry nhưng mất toàn bộ index hoặc sửa DB ngoài API vẫn cần reindex. Migration BookSearchSync mới chỉ áp trên database audit, chưa áp lên database mặc định.</w:t>
+        <w:t xml:space="preserve">Trước khi triển khai trên database đang có dữ liệu, sao lưu và xem migration BookSearchSync; migration này mới được áp trên database audit. Khi vận hành, theo dõi outbox và xử lý message trong DLQ; nếu mất toàn bộ index hoặc sửa sách trực tiếp trong PostgreSQL, chạy reindex. Kiểm thử bảo mật độc lập khi cần đánh giá môi trường triển khai thực tế.</w:t>
       </w:r>
     </w:p>
     <w:p xmlns:w="http://schemas.openxmlformats.org/wordprocessingml/2006/main">
@@ -131,7 +131,7 @@
         <w:spacing w:after="120"/>
       </w:pPr>
       <w:r>
-        <w:t xml:space="preserve">Bằng chứng chi tiết: backend/docs/evidence/rubric-followup-20261020.md; PR #12: https://github.com/Thuat3Tuoi/book_selling_system/pull/12; CI PR: https://github.com/Thuat3Tuoi/book_selling_system/actions/runs/39351215489. Số liệu kiểm thử gắn với SHA bb7593c và môi trường audit; mã đã merge vào main, còn database mặc định chưa được migrate.</w:t>
+        <w:t xml:space="preserve">Tra cứu bằng chứng chi tiết tại backend/docs/evidence/rubric-followup-20261020.md, PR #12 (https://github.com/Thuat3Tuoi/book_selling_system/pull/12) và CI run 39351215489. Khi lặp lại phép thử, dùng đúng SHA bb7593c và database audit riêng; không áp kết quả này cho database mặc định chưa được migrate.</w:t>
       </w:r>
     </w:p>
     <w:p>
@@ -1861,7 +1861,7 @@
           <w:color w:val="000000" w:themeColor="text1"/>
           <w:szCs w:val="26"/>
         </w:rPr>
-        <w:t>NestJS được chọn làm backend vì có Module, Controller, Provider và Dependency Injection trên Node.js/TypeScript [1]. Mã đã kiểm chứng dùng NestJS 12 với Express adapter, Next.js 16, Prisma 7/PostgreSQL, Redis, RabbitMQ và Meilisearch. Báo cáo phân biệt triển khai trong mã, phép thử đã chạy và giới hạn còn lại.</w:t>
+        <w:t>Dùng NestJS để tổ chức backend theo Module, Controller, Provider và Dependency Injection trên Node.js/TypeScript [1]. Các chương sau hướng dẫn kiểm tra bản triển khai NestJS 12 với Express adapter, Next.js 16, Prisma 7/PostgreSQL, Redis, RabbitMQ và Meilisearch; mỗi kết quả được gắn với mã nguồn và phép thử tương ứng.</w:t>
       </w:r>
     </w:p>
     <w:p>
@@ -2741,7 +2741,7 @@
           <w:color w:val="000000" w:themeColor="text1"/>
           <w:szCs w:val="26"/>
         </w:rPr>
-        <w:t>Mục tiêu kiến thức là giải thích và chứng minh bốn thành phần bắt buộc lõi của NestJS: Module, Controller, Provider/Service và Dependency Injection (Chương 4). Mã sản phẩm được khóa tham chiếu tại SHA bb7593c; file báo cáo thuộc nhánh tài liệu PR #13.</w:t>
+        <w:t>Đọc Chương 4 theo thứ tự Module, Controller, Provider/Service và Dependency Injection để hiểu bốn thành phần lõi của NestJS. Khi kiểm tra ví dụ, đối chiếu mã sản phẩm tại SHA bb7593c; file báo cáo thuộc nhánh tài liệu PR #13.</w:t>
       </w:r>
     </w:p>
     <w:p>
@@ -2757,7 +2757,7 @@
           <w:color w:val="000000" w:themeColor="text1"/>
           <w:szCs w:val="26"/>
         </w:rPr>
-        <w:t>Mục tiêu kỹ năng là thực hành DTO/ValidationPipe, Guard/RBAC, Interceptor, Exception Filter, Prisma transaction, Redis cache, RabbitMQ/outbox, cron, Meilisearch, Docker Compose và kiểm thử. Chỉ các kỹ thuật đã có mã cùng bằng chứng chạy thật mới vào Bảng phủ mục 12.3.</w:t>
+        <w:t>Thực hiện các bài tập ở Chương 5–12 để kiểm tra DTO/ValidationPipe, Guard/RBAC, Interceptor, Exception Filter, Prisma transaction, Redis cache, RabbitMQ/outbox, cron, Meilisearch, Docker Compose và kiểm thử. Dùng Bảng phủ mục 12.3 để truy vết từng kỹ thuật tới mã và bằng chứng chạy thật.</w:t>
       </w:r>
     </w:p>
     <w:p>
@@ -2835,7 +2835,7 @@
           <w:color w:val="000000" w:themeColor="text1"/>
           <w:szCs w:val="26"/>
         </w:rPr>
-        <w:t>Kiến trúc là modular monolith NestJS; RabbitMQ consumer chạy trong cùng tiến trình. Không triển khai thanh toán thật hoặc WebSocket. Luồng mua hàng, HTTP envelope và các dịch vụ nền đã được kiểm chứng trên môi trường audit cô lập; database mặc định của người dùng chưa áp migration BookSearchSync.</w:t>
+        <w:t>Triển khai backend theo kiến trúc modular monolith; RabbitMQ consumer chạy trong cùng tiến trình NestJS. Phạm vi bài thực hành không gồm thanh toán thật hoặc WebSocket. Khi chạy lại luồng mua hàng, dùng môi trường audit cô lập; trước khi áp BookSearchSync trên database mặc định, sao lưu và xem migration.</w:t>
       </w:r>
     </w:p>
     <w:p>
@@ -2969,7 +2969,7 @@
         <w:pStyle w:val="Normal"/>
       </w:pPr>
       <w:r>
-        <w:t xml:space="preserve">Khung 12 tuần dưới đây là kế hoạch theo mẫu học phần. Repository chỉ chứng minh các mốc Git từ 20/09 đến 20/10/2026; không có file theo dõi tuần học và phân công đầy đủ để xác nhận tuần thực tế. Phụ lục 1 ghi mốc đã xác minh, không gán tuần giả.</w:t>
+        <w:t xml:space="preserve">Dùng khung 12 tuần dưới đây để lập kế hoạch theo mẫu học phần. Khi điền nhật ký thực tế, đối chiếu từng tuần với commit, phân công và tài liệu nhóm. Repository hiện chỉ xác nhận các mốc Git từ 20/09 đến 20/10/2026; giữ cột tuần ở trạng thái chưa xác định nếu chưa có hồ sơ đối chứng.</w:t>
       </w:r>
     </w:p>
     <w:tbl>
@@ -3594,7 +3594,7 @@
         <w:pStyle w:val="Normal"/>
       </w:pPr>
       <w:r>
-        <w:t xml:space="preserve">Dấu vết Git theo ngày: 20–23/09 khởi tạo auth/sách/giỏ; 25–30/09 interceptor, validation, frontend, RabbitMQ, cron và CI; 04–09/10 Meilisearch, Redis và unit test; 12–16/10 frontend, Compose và envelope; 19–20/10 audit, E2E, retry search, review và merge PR #12. Các mốc ngày không tự xác nhận tuần học tương ứng.</w:t>
+        <w:t xml:space="preserve">Đối chiếu tiến độ với Git log theo ngày: 20–23/09 khởi tạo auth/sách/giỏ; 25–30/09 thêm interceptor, validation, frontend, RabbitMQ, cron và CI; 04–09/10 thêm Meilisearch, Redis và unit test; 12–16/10 cập nhật frontend, Compose và envelope; 19–20/10 audit, E2E, retry search, review và merge PR #12. Chỉ gán tuần học sau khi có lịch học hoặc weekly log xác nhận.</w:t>
       </w:r>
     </w:p>
     <w:p>
@@ -21902,7 +21902,7 @@
           <w:color w:val="000000" w:themeColor="text1"/>
           <w:szCs w:val="26"/>
         </w:rPr>
-        <w:t>Backend mặc định lắng nghe cổng 3001; GET /health trả trạng thái dịch vụ. Swagger UI ở /api-docs và OpenAPI JSON ở /api-docs-json. CI dùng Node.js 22. Biến môi trường bắt buộc được kiểm tra lúc khởi động; Compose là cách tái lập đầy đủ hơn lệnh start:dev độc lập.</w:t>
+        <w:t>Để chạy backend riêng, cấu hình các biến môi trường bắt buộc rồi dùng lệnh trong mục 3.2; kiểm tra GET /health ở cổng 3001, Swagger UI tại /api-docs và OpenAPI JSON tại /api-docs-json. Để tái lập đầy đủ PostgreSQL, Redis, RabbitMQ và Meilisearch, dùng Docker Compose ở mục 3.4. CI sử dụng Node.js 22.</w:t>
       </w:r>
     </w:p>
     <w:p>
@@ -22491,7 +22491,7 @@
           <w:color w:val="000000" w:themeColor="text1"/>
           <w:szCs w:val="26"/>
         </w:rPr>
-        <w:t>Lệnh Compose chạy trong backend. Cấu hình tạo PostgreSQL, Redis, RabbitMQ, Meilisearch, container migrate và backend; frontend chạy riêng. Seed an toàn prisma:seed:safe chỉ thêm dữ liệu thiếu trên database thử nghiệm; seed cũ có thao tác xóa dữ liệu và yêu cầu cờ xác nhận riêng. Lần kiểm chứng cuối áp 10/10 migration trên database audit.</w:t>
+        <w:t>Từ thư mục backend, kiểm tra cấu hình Compose, khởi động các service rồi xem trạng thái container theo các lệnh ở trên. Compose chạy PostgreSQL, Redis, RabbitMQ, Meilisearch, migrate và backend; frontend chạy riêng. Chỉ chạy prisma:seed:safe trên database phát triển với các biến seed được yêu cầu; dùng database audit riêng khi lặp lại 10/10 migration.</w:t>
       </w:r>
     </w:p>
     <w:p>
@@ -25046,7 +25046,7 @@
           <w:color w:val="000000" w:themeColor="text1"/>
           <w:szCs w:val="26"/>
         </w:rPr>
-        <w:t>Giới hạn kiểm chứng: đoạn testing module cho thấy DI có thể thay provider bằng mock; nó không chứng minh truy vấn PostgreSQL hay transaction đúng. Các provider trong ví dụ là singleton mặc định; request-scoped provider chỉ cần khi trạng thái phụ thuộc từng request và làm tăng chi phí tạo đối tượng [6].</w:t>
+        <w:t>Dùng testing module để thay provider bằng mock và kiểm tra logic DI. Muốn xác nhận truy vấn PostgreSQL hoặc transaction, chạy thêm test tích hợp/E2E với database thử nghiệm; riêng ví dụ mock không đủ cho bước đó. Giữ provider mặc định ở phạm vi singleton, chỉ dùng request scope khi trạng thái phụ thuộc từng request [6].</w:t>
       </w:r>
     </w:p>
     <w:p>
@@ -25054,7 +25054,7 @@
         <w:pStyle w:val="Normal"/>
       </w:pPr>
       <w:r>
-        <w:t xml:space="preserve">Tóm tắt lõi NestJS trong sản phẩm: Module xác định ranh giới; Controller ánh xạ HTTP; Provider xử lý nghiệp vụ; DI nối và cho phép thay dependency khi kiểm thử. Bốn tiểu mục 4.1–4.4 đã nêu cơ chế, mã, kết quả và ý nghĩa tương ứng; Bảng phủ 12.3 truy vết các file theo SHA bb7593c.</w:t>
+        <w:t xml:space="preserve">Theo dõi Chương 4 theo luồng: Module xác định ranh giới; Controller ánh xạ HTTP; Provider xử lý nghiệp vụ; DI cung cấp dependency và cho phép thay bằng mock khi kiểm thử. Mở các file trong Bảng phủ 12.3 để đối chiếu với mã tại SHA bb7593c.</w:t>
       </w:r>
     </w:p>
     <w:p>
@@ -25094,7 +25094,7 @@
         <w:pStyle w:val="Normal"/>
       </w:pPr>
       <w:r>
-        <w:t xml:space="preserve">E2E gửi HTTP thật tới POST /books với token staff trên môi trường audit: giá âm, field dư và thiếu trường đều trả 400; payload hợp lệ trả 201. Test POST /auth/register trả 400 trước đây không được dùng làm bằng chứng thay thế cho route sách. File: backend/src/books/dtos, books.controller.ts, main.ts và backend/test; kết quả 15/15 E2E ở mục 12.2.</w:t>
+        <w:t xml:space="preserve">Dùng token staff gọi POST /books trên môi trường audit: gửi lần lượt giá âm, field dư và payload thiếu trường; mong đợi HTTP 400. Gửi payload hợp lệ; mong đợi HTTP 201. Đối chiếu DTO, books.controller.ts, main.ts và backend/test; kết quả thuộc bộ 15/15 E2E ở mục 12.2.</w:t>
       </w:r>
     </w:p>
     <w:tbl>
@@ -25456,7 +25456,7 @@
         <w:pStyle w:val="Normal"/>
       </w:pPr>
       <w:r>
-        <w:t xml:space="preserve">HTTP E2E dùng customer A, customer B và staff trên database audit: không token trả 401, customer gọi route quản trị trả 403, customer B đọc/sửa đơn A trả 404, chủ đơn đọc được 200 và staff có thể cập nhật trạng thái. Các ca này giới hạn ở chính sách và dữ liệu thử nghiệm đã ghi trong test, không thay thế pentest độc lập.</w:t>
+        <w:t xml:space="preserve">Dùng customer A, customer B và staff trên database audit để kiểm tra quyền truy cập: request không token phải trả 401; customer gọi route quản trị trả 403; customer B đọc hoặc sửa đơn A trả 404; chủ đơn đọc được 200 và staff cập nhật được trạng thái. Các ca HTTP này kiểm tra chính sách đã triển khai; đánh giá bảo mật rộng hơn cần phép thử riêng.</w:t>
       </w:r>
     </w:p>
     <w:p>
@@ -25472,7 +25472,7 @@
         <w:pStyle w:val="Normal"/>
       </w:pPr>
       <w:r>
-        <w:t xml:space="preserve">AppModule đăng ký LoggingInterceptor và ResponseEnvelopeInterceptor cùng Exception Filter toàn cục. Luồng HTTP thêm X-Request-ID, log thời gian và trả thành công theo {success,data,meta?}; lỗi theo {success:false,error}. HTTP từ image audit đã xác nhận /health 200, /books 200 cùng envelope và /api-docs-json 200. Interceptor HTTP không bọc message RabbitMQ; log request không phải trace phân tán.</w:t>
+        <w:t xml:space="preserve">Gửi request HTTP đến backend để kiểm tra X-Request-ID, log thời gian và envelope thành công {success,data,meta?}; gửi request lỗi để kiểm tra {success:false,error}. Trên image audit, đối chiếu /health 200, /books 200 và /api-docs-json 200. Kiểm tra message RabbitMQ riêng vì interceptor HTTP không áp dụng cho broker.</w:t>
       </w:r>
     </w:p>
     <w:p>
@@ -25480,7 +25480,7 @@
         <w:pStyle w:val="Normal"/>
       </w:pPr>
       <w:r>
-        <w:t xml:space="preserve">Các file minh chứng: backend/src/common/interceptors, common/filters, app.module.ts và docs/API_RESPONSE.md. So sánh source/container cũ ngày 16/10 từng phát hiện envelope lệch; Chương 13 phân tích cách khóa SHA và rebuild để loại sai lệch đó.</w:t>
+        <w:t xml:space="preserve">Tra cứu backend/src/common/interceptors, common/filters, app.module.ts và docs/API_RESPONSE.md để lần theo cách tạo response. Khi source và container trả envelope khác nhau, khóa cùng SHA, build lại image và gọi lại API trước khi so sánh; Chương 13 ghi một trường hợp đã gặp.</w:t>
       </w:r>
     </w:p>
     <w:p>
@@ -25504,7 +25504,7 @@
         <w:pStyle w:val="Normal"/>
       </w:pPr>
       <w:r>
-        <w:t xml:space="preserve">BooksService và CartsService dùng Redis cache-aside, TTL 300 giây. Khóa giỏ chứa userId; E2E kiểm tra hai tài khoản không thấy giỏ của nhau. Cập nhật sách/giỏ xóa khóa chi tiết và danh sách liên quan. Thử dừng Redis trên môi trường audit: PATCH và GET vẫn lấy giá mới từ PostgreSQL; khi Redis hồi phục, pending invalidation xóa giá trị cũ. Đây là chính sách fail-open cho cache, không bảo đảm độ trễ khi cache hỏng.</w:t>
+        <w:t xml:space="preserve">Để kiểm tra cache, gọi lặp lại API sách hoặc giỏ và xem key Redis có TTL 300 giây. Dùng hai tài khoản để kiểm tra khóa giỏ theo userId; sửa sách hoặc giỏ rồi xác nhận các key liên quan bị xóa. Khi thử dừng Redis trên database audit, PATCH và GET vẫn phải lấy giá mới từ PostgreSQL; sau khi bật lại, xác nhận pending invalidation xóa giá trị cũ.</w:t>
       </w:r>
     </w:p>
     <w:p>
@@ -25520,7 +25520,7 @@
         <w:pStyle w:val="Normal"/>
       </w:pPr>
       <w:r>
-        <w:t xml:space="preserve">Migration 20261019020000_order_user_created_index tạo index Order(userId,createdAt DESC). Trên 50.001 đơn audit, cùng truy vấn lọc userId và sắp xếp createdAt, EXPLAIN ANALYZE cho 2,416 ms trước index và 0,339 ms sau index; shared buffer hits giảm 471 xuống 15. Pha bỏ index được rollback. PostgreSQL vẫn Sort vì truy vấn trả toàn bộ đơn của user. Plan đầy đủ ở backend/docs/evidence/explain-orders-20261019.txt; đây là số liệu dataset audit, không phải latency production.</w:t>
+        <w:t xml:space="preserve">Dùng EXPLAIN ANALYZE với truy vấn lọc userId và sắp xếp createdAt trước/sau migration 20261019020000_order_user_created_index. Trên 50.001 đơn audit, thời gian tham chiếu là 2,416 ms trước index và 0,339 ms sau index; shared buffer hits giảm từ 471 xuống 15. Đọc plan tại backend/docs/evidence/explain-orders-20261019.txt; PostgreSQL vẫn Sort vì truy vấn trả toàn bộ đơn của user. Chỉ dùng số liệu này cho dataset audit.</w:t>
       </w:r>
     </w:p>
     <w:p>
@@ -25544,7 +25544,7 @@
         <w:pStyle w:val="Normal"/>
       </w:pPr>
       <w:r>
-        <w:t xml:space="preserve">OrdersService ghi Order và OutboxEvent trong cùng transaction PostgreSQL. Publisher phát order.created sau commit, giữ PENDING và retry với backoff khi broker lỗi. Consumer dùng eventId duy nhất ở Notification để chống tạo trùng; message lỗi bị nack(false,false) sang dead-letter queue. Mức đảm bảo là giao nhận ít nhất một lần, không phải exactly-once; DLQ cần người vận hành kiểm tra/replay.</w:t>
+        <w:t xml:space="preserve">Khi tạo đơn, kiểm tra Order và OutboxEvent được ghi trong cùng transaction PostgreSQL. Sau commit, theo dõi publisher phát order.created; nếu broker lỗi, outbox giữ PENDING để thử lại theo backoff. Kiểm tra Notification theo eventId để xác nhận phát trùng không tạo thêm bản ghi; xem DLQ khi consumer từ chối message. Luồng này giao nhận ít nhất một lần.</w:t>
       </w:r>
     </w:p>
     <w:p>
@@ -25552,7 +25552,7 @@
         <w:pStyle w:val="Normal"/>
       </w:pPr>
       <w:r>
-        <w:t xml:space="preserve">Thử thật trên Compose audit: dừng RabbitMQ, POST /orders trả 201, outbox attempts=1 và notification=0; bật lại, outbox PUBLISHED, attempts=3 và notification=1. Phát lại cùng event: notification vẫn 1. Message không hợp lệ vào DLQ: 1 message, 0 notification. Không có email thật; consumer chỉ tạo Notification trong DB.</w:t>
+        <w:t xml:space="preserve">Để thử gián đoạn broker trên Compose audit, dừng RabbitMQ rồi gọi POST /orders; mong đợi HTTP 201, outbox attempts=1 và notification=0. Bật broker lại; mong đợi outbox PUBLISHED, attempts=3 và notification=1. Phát lại cùng event để xác nhận notification vẫn là 1; gửi message lỗi để kiểm tra DLQ có 1 message và không tạo notification. Consumer chỉ ghi Notification trong database.</w:t>
       </w:r>
     </w:p>
     <w:p>
@@ -25568,7 +25568,7 @@
         <w:pStyle w:val="Normal"/>
       </w:pPr>
       <w:r>
-        <w:t xml:space="preserve">Cron chạy 08:00 theo Asia/Ho_Chi_Minh. Job chọn ADMIN đang hoạt động, nếu không có thì STAFF; không có người nhận hoặc không có sách ít hàng thì return, không ghi thông báo rỗng. eventId theo ngày Việt Nam là duy nhất; phép thử hai AppModule instance đồng thời tạo đúng một notification không rỗng trên database audit.</w:t>
+        <w:t xml:space="preserve">Kiểm tra cron lúc 08:00 theo Asia/Ho_Chi_Minh: ưu tiên ADMIN đang hoạt động, nếu không có thì chọn STAFF. Không có người nhận hoặc không có sách ít hàng thì không tạo thông báo. Chạy hai AppModule instance trên database audit để xác nhận eventId theo ngày Việt Nam chỉ tạo một notification không rỗng.</w:t>
       </w:r>
     </w:p>
     <w:p>
@@ -25608,7 +25608,7 @@
         <w:pStyle w:val="Normal"/>
       </w:pPr>
       <w:r>
-        <w:t xml:space="preserve">Trong thử nghiệm audit, dừng Meilisearch rồi sửa sách: database giữ giá trị mới và BookSearchSync có attempts=1; sau khi bật dịch vụ, tìm thấy tiêu đề mới và hàng đợi còn 0. Nếu mất toàn bộ index hoặc dữ liệu được sửa ngoài API, chạy search:reindex để xây lại; lúc dịch vụ dừng, API tìm kiếm không khả dụng. Chưa có bộ đánh giá độ chính xác top-k hoặc benchmark latency tìm kiếm.</w:t>
+        <w:t xml:space="preserve">Để kiểm tra retry tìm kiếm trên môi trường audit, dừng Meilisearch rồi sửa sách; xác nhận PostgreSQL lưu giá trị mới và BookSearchSync tăng attempts. Bật Meilisearch lại; tìm tiêu đề mới và kiểm tra hàng đợi về 0. Nếu mất toàn bộ index hoặc sửa dữ liệu ngoài API, chạy search:reindex. Khi dịch vụ dừng, chờ search phục hồi trước khi dùng endpoint tìm kiếm.</w:t>
       </w:r>
     </w:p>
     <w:p>
@@ -25930,7 +25930,7 @@
           <w:color w:val="000000" w:themeColor="text1"/>
           <w:szCs w:val="26"/>
         </w:rPr>
-        <w:t>Frontend Next.js (cổng 3000) gọi REST API NestJS (cổng 3001); backend tích hợp PostgreSQL, Redis, RabbitMQ và Meilisearch. Frontend build đã qua TypeScript trên SHA bb7593c; HTTP E2E kiểm tra luồng đặt hàng ở backend, chưa có bằng chứng kiểm thử tự động toàn bộ thao tác trên trình duyệt.</w:t>
+        <w:t>Khi chạy hệ thống, truy cập frontend Next.js ở cổng 3000 và REST API NestJS ở cổng 3001; backend kết nối PostgreSQL, Redis, RabbitMQ và Meilisearch. Dùng HTTP E2E để kiểm tra luồng đặt hàng ở backend. Nếu cần xác nhận toàn bộ thao tác trên trình duyệt, bổ sung kiểm thử UI riêng; frontend build trên SHA bb7593c đã qua TypeScript.</w:t>
       </w:r>
     </w:p>
     <w:p>
@@ -26678,7 +26678,7 @@
           <w:color w:val="000000" w:themeColor="text1"/>
           <w:szCs w:val="26"/>
         </w:rPr>
-        <w:t>frontend/src/lib/api.ts dùng NEXT_PUBLIC_API_URL và bearer token. main.ts cấu hình CORS, cookie-parser và RabbitMQ consumer. Compose chạy sáu service backend/phụ thuộc; frontend chạy ngoài Compose. Hình 11.1 là kiến trúc theo mã và đã được đối chiếu với runtime audit, không phải sơ đồ triển khai production.</w:t>
+        <w:t>Đối chiếu frontend/src/lib/api.ts để kiểm tra NEXT_PUBLIC_API_URL và bearer token; đối chiếu main.ts để kiểm tra CORS, cookie-parser và RabbitMQ consumer. Khi dựng lại sơ đồ Hình 11.1, đặt frontend ngoài Compose và sáu service backend/phụ thuộc trong Compose. Dùng sơ đồ cho cấu hình đã kiểm tra, không suy rộng thành triển khai production.</w:t>
       </w:r>
     </w:p>
     <w:p>
@@ -28057,7 +28057,7 @@
         <w:pStyle w:val="Normal"/>
       </w:pPr>
       <w:r>
-        <w:t xml:space="preserve">Module/Controller/Provider/DI ở Chương 4 được dùng trực tiếp cho auth, sách, giỏ, đơn và thông báo. DTO/Pipe chặn request sai; JWT, StaffAuthGuard và kiểm tra userId bảo vệ tài nguyên. Prisma transaction tạo đơn, chi tiết, trừ kho có điều kiện, xóa giỏ và outbox; Redis hỗ trợ cache đọc; RabbitMQ/consumer tạo thông báo; cron cảnh báo tồn kho; Meilisearch lập chỉ mục sách qua BookSearchSync. Các bài test đơn lẻ ở Phần 2 là bằng chứng hiểu cơ chế; E2E ở đây chứng minh tích hợp trong sản phẩm.</w:t>
+        <w:t xml:space="preserve">Lần theo luồng tích hợp từ Module/Controller/Provider/DI ở Chương 4 tới auth, sách, giỏ, đơn và thông báo. Kiểm tra DTO/Pipe ở đầu request, JWT/StaffAuthGuard và userId khi truy cập tài nguyên, rồi transaction Prisma khi tạo đơn. Sau đó kiểm tra cache Redis, publisher/consumer RabbitMQ, cron và BookSearchSync. Dùng E2E để xác nhận các thành phần phối hợp trên cùng môi trường thử nghiệm.</w:t>
       </w:r>
     </w:p>
     <w:p>
@@ -28081,7 +28081,7 @@
         <w:pStyle w:val="Normal"/>
       </w:pPr>
       <w:r>
-        <w:t xml:space="preserve">Mốc mã đối chiếu: bb7593cd5ade583d851144ffbec2f745ad9427cf. Trên Compose project/database audit tách biệt, image từ clone sạch có cùng RootFS layer/history với image đã chạy E2E; 10/10 migration, /health 200, /books 200 với envelope và /api-docs-json 200. Swagger có response schema cho 28/28 operation. E2E 15/15 kiểm tra quyền hai customer/staff, DTO sách, giỏ, đơn, broker, cron, cache và search. E2E không chạy trong CI và không chứng minh giao diện trình duyệt end-to-end.</w:t>
+        <w:t xml:space="preserve">Để tái lập kết quả, dùng mã tại bb7593cd5ade583d851144ffbec2f745ad9427cf và Compose project/database audit riêng. Xác nhận 10/10 migration, /health 200, /books 200 với envelope và /api-docs-json 200; kiểm tra response schema cho 28/28 operation. Chạy 15/15 E2E để kiểm tra quyền hai customer/staff, DTO sách, giỏ, đơn, broker, cron, cache và search. E2E hiện chạy riêng ngoài CI; kiểm thử trình duyệt cần thực hiện bổ sung.</w:t>
       </w:r>
     </w:p>
     <w:tbl>
@@ -28647,7 +28647,7 @@
         <w:pStyle w:val="Normal"/>
       </w:pPr>
       <w:r>
-        <w:t xml:space="preserve">Cách chạy lại trên database phát triển tách biệt: sao chép backend/.env.example thành backend/.env, đặt mật khẩu PostgreSQL/RabbitMQ, khóa Meilisearch và JWT_SECRET; trong backend chạy npm ci, npm run prisma:generate, docker compose up -d --build, rồi kiểm tra docker compose ps --all và GET /health. Swagger ở /api-docs; frontend đặt NEXT_PUBLIC_API_URL rồi npm ci và npm run dev. Chỉ chạy seed-safe với SEED_SAMPLE_DATA=YES và SEED_DEFAULT_PASSWORD trên database có thể thử nghiệm. E2E có ghi dữ liệu và yêu cầu E2E_ISOLATED_DB=YES. README và backend/DOCKER.md có lệnh đầy đủ.</w:t>
+        <w:t xml:space="preserve">Để chạy lại trên database phát triển tách biệt: (1) sao chép backend/.env.example thành backend/.env và đặt mật khẩu PostgreSQL/RabbitMQ, khóa Meilisearch, JWT_SECRET; (2) trong backend chạy npm ci, npm run prisma:generate và docker compose up -d --build; (3) kiểm tra docker compose ps --all và GET /health; (4) trong frontend đặt NEXT_PUBLIC_API_URL, chạy npm ci và npm run dev. Chỉ chạy seed-safe khi đã đặt SEED_SAMPLE_DATA=YES và SEED_DEFAULT_PASSWORD trên database thử nghiệm. E2E ghi dữ liệu và yêu cầu E2E_ISOLATED_DB=YES. Xem README và backend/DOCKER.md để sao chép lệnh đầy đủ.</w:t>
       </w:r>
     </w:p>
     <w:p>
@@ -28655,7 +28655,7 @@
         <w:pStyle w:val="Normal"/>
       </w:pPr>
       <w:r>
-        <w:t xml:space="preserve">Dữ liệu sau phép thử RabbitMQ: đơn 50002 commit khi broker dừng; notification 0 trước hồi phục, 1 sau hồi phục và vẫn 1 khi phát trùng; DLQ có 1 message lỗi. Redis: giá sách sau PATCH/GET vẫn mới trong lúc Redis dừng, cache cũ được xóa khi hồi phục. Cron hai instance tạo 1 thông báo không rỗng. Meilisearch: yêu cầu đồng bộ chờ khi service dừng, rồi tiêu đề mới tìm được sau retry. Chi tiết và điều kiện thử trong backend/docs/evidence/runtime-verification-20261019.md và rubric-followup-20261020.md.</w:t>
+        <w:t xml:space="preserve">Đối chiếu kết quả thử RabbitMQ: đơn 50002 vẫn commit khi broker dừng; notification chuyển từ 0 lên 1 sau hồi phục và vẫn là 1 khi phát trùng; DLQ giữ 1 message lỗi. Với Redis, kiểm tra giá sau PATCH/GET còn mới khi cache dừng và key cũ bị xóa khi hồi phục. Với cron, hai instance tạo 1 thông báo; với Meilisearch, yêu cầu chờ được xử lý sau retry. Điều kiện thử ghi trong backend/docs/evidence/runtime-verification-20261019.md và rubric-followup-20261020.md.</w:t>
       </w:r>
     </w:p>
     <w:p>
@@ -28671,7 +28671,7 @@
         <w:pStyle w:val="Normal"/>
       </w:pPr>
       <w:r>
-        <w:t xml:space="preserve">Chỉ các kỹ thuật có trong sản phẩm/chuẩn repo tại SHA đã merge mới được tính. Tầng 1 là phần NestJS lõi và chọn thêm; Tầng 2 là kỹ nghệ phần mềm; Tầng 3 là kỹ thuật nâng cao. Bảng này là tự đối chiếu, không phải điểm chấm chính thức. Hồ sơ nộp cần khóa báo cáo cùng commit/version trước buổi bảo vệ theo quy định học phần.</w:t>
+        <w:t xml:space="preserve">Dùng Bảng phủ 12.3 để lần từ từng kỹ thuật ở Phần 2 đến chức năng, file và bằng chứng ở Phần 3. Tầng 1 gồm NestJS lõi và phần chọn thêm; Tầng 2 gồm kỹ nghệ phần mềm; Tầng 3 gồm kỹ thuật nâng cao. Chỉ đánh dấu kỹ thuật có trong mã tại SHA đã merge. Trước buổi bảo vệ, khóa báo cáo cùng commit/version theo quy định học phần.</w:t>
       </w:r>
     </w:p>
     <w:tbl>
@@ -30362,7 +30362,7 @@
         <w:pStyle w:val="Normal"/>
       </w:pPr>
       <w:r>
-        <w:t xml:space="preserve">Bốn thành phần lõi NestJS đã có cơ chế, mã và kiểm thử. Các mục chọn thêm DTO, Guard và Interceptor vận hành qua HTTP; Redis, RabbitMQ, cron, Meilisearch, PostgreSQL index và Compose được kiểm chứng trên môi trường audit. Frontend từ mốc 16/10 còn bảy lỗi TypeScript đã chuyển sang build đạt ở SHA bb7593c. CI chạy unit/API và frontend build; E2E chạy riêng trên database audit. Thay đổi lớn nhất so với kế hoạch ban đầu là bổ sung outbox, ownership/RBAC, retry search và quy trình seed an toàn sau khi thử lỗi thực tế.</w:t>
+        <w:t xml:space="preserve">Đối chiếu mục tiêu ban đầu với mã và phép thử: bốn thành phần lõi NestJS có ví dụ và test; DTO, Guard, Interceptor vận hành qua HTTP; Redis, RabbitMQ, cron, Meilisearch, PostgreSQL index và Compose đã được thử trên môi trường audit. Frontend đã chuyển từ bảy lỗi TypeScript ở mốc 16/10 sang build đạt tại SHA bb7593c. Dùng CI cho unit/API và frontend build, dùng database audit riêng cho E2E. Khi xem lịch sử thay đổi, chú ý các phần outbox, ownership/RBAC, retry search và seed an toàn.</w:t>
       </w:r>
     </w:p>
     <w:p>
@@ -30370,7 +30370,7 @@
         <w:pStyle w:val="Normal"/>
       </w:pPr>
       <w:r>
-        <w:t xml:space="preserve">Mức hoàn thành được mô tả theo kết quả, không quy đổi thành điểm: audit kỹ thuật ghi 23/23 tiêu chí có bằng chứng, nhưng chưa có pentest độc lập hoặc nghiệm thu production. Migration BookSearchSync chưa áp trên database mặc định. Chương 1 chưa có ứng dụng Express đối chứng cùng môi trường nên không khẳng định ưu thế định lượng NestJS; nhật ký tuần/lab và ảnh Insights chưa có trong nguồn hiện tại.</w:t>
+        <w:t xml:space="preserve">Khi tổng kết, dẫn bằng chứng cho 23/23 tiêu chí kỹ thuật trong bảng audit và ghi rõ đây là tự đối chiếu, không phải điểm chấm. Trước khi triển khai, kiểm thử bảo mật độc lập và áp migration BookSearchSync có sao lưu trên database mặc định. Nếu cần so sánh NestJS với Express, tạo ứng dụng đối chứng cùng môi trường; bổ sung weekly log, hồ sơ lab và ảnh Insights trước khi hoàn thiện hồ sơ nộp.</w:t>
       </w:r>
     </w:p>
     <w:p>
@@ -30386,7 +30386,7 @@
         <w:pStyle w:val="Normal"/>
       </w:pPr>
       <w:r>
-        <w:t xml:space="preserve">Lỗi 1 — Docker runtime không khởi động đúng dù build cục bộ qua. Khi build image bằng npm 10, lockfile thiếu typescript@5.9.3; sau khi tái tạo lockfile, lần khởi động tiếp phát hiện JwtAuthGuard thiếu Passport provider trong NotificationsModule và OrderItemsModule. Nguyên nhân là khác biệt môi trường build và dependency injection chỉ lộ khi module thật khởi tạo. Nhóm sửa lockfile và import PassportModule, build lại image từ clone sạch, kiểm tra /health 200, /api-docs-json 200 và 15/15 E2E. Log/mốc sửa được ghi ở backend/docs/evidence/runtime-verification-20261019.md; cần chèn ảnh log đỏ khi nộp PDF nếu giảng viên yêu cầu ảnh chụp thay cho trích dẫn file.</w:t>
+        <w:t xml:space="preserve">Khi Docker runtime không khởi động dù build cục bộ qua, kiểm tra lockfile với đúng phiên bản npm của image; trường hợp đã gặp thiếu typescript@5.9.3 khi build bằng npm 10. Sau khi tạo lại lockfile, kiểm tra dependency injection lúc module khởi tạo: JwtAuthGuard cần Passport provider trong NotificationsModule và OrderItemsModule. Import PassportModule, build image từ clone sạch rồi xác nhận /health 200, /api-docs-json 200 và 15/15 E2E. Mốc lỗi và cách sửa ghi tại backend/docs/evidence/runtime-verification-20261019.md.</w:t>
       </w:r>
     </w:p>
     <w:p>
@@ -30410,7 +30410,7 @@
         <w:pStyle w:val="Normal"/>
       </w:pPr>
       <w:r>
-        <w:t xml:space="preserve">Lỗi 2 — thay đổi sách khi Meilisearch dừng làm DB/index lệch. Trước sửa, BooksService ghi PostgreSQL rồi gọi index; lỗi search bị log nhưng không còn yêu cầu retry. Thử runtime ban đầu: sau khi bật search lại vẫn 0 hit, chỉ reindex thủ công mới trả 1 hit. Nhóm thêm BookSearchSync trong cùng transaction với Book, worker lease/revision/retry và chỉ xóa yêu cầu sau khi task hoàn tất. Thử lại: khi search dừng attempts=1, sau hồi phục tìm đúng tiêu đề mới và hàng đợi về 0. Bằng chứng trước/sau ở runtime-verification-20261019.md và rubric-followup-20261020.md; mã ở src/books/books.service.ts, src/search/* và migration 20261020000000_book_search_sync.</w:t>
+        <w:t xml:space="preserve">Khi sửa sách trong lúc Meilisearch dừng, kiểm tra cả PostgreSQL lẫn index. Trước khi có BookSearchSync, lỗi lập chỉ mục chỉ được log nên sau hồi phục search vẫn trả 0 hit; chạy reindex thủ công mới có 1 hit. Để giữ yêu cầu đồng bộ, ghi BookSearchSync trong cùng transaction với Book; worker dùng lease, revision và backoff, chỉ xóa yêu cầu sau khi task thành công. Thử lại bằng cách dừng/bật dịch vụ: attempts tăng khi dừng, tiêu đề mới xuất hiện và hàng đợi về 0 sau hồi phục. Đối chiếu mã src/books/books.service.ts, src/search/* và migration 20261020000000_book_search_sync.</w:t>
       </w:r>
     </w:p>
     <w:p>
@@ -30442,7 +30442,7 @@
         <w:pStyle w:val="Normal"/>
       </w:pPr>
       <w:r>
-        <w:t xml:space="preserve">Nhật ký backend/docs/AI_DISCLOSURE.md ghi người thực hiện Viet dùng Claude để review mã, giải thích lỗi, đề xuất thiết kế, sinh code và test cho DTO/Pipe, Meilisearch, sách/giỏ; Codex hỗ trợ audit rubric, sửa và kiểm chứng runtime ở lượt 19–20/10. Các vùng có tỷ trọng AI hỗ trợ cao theo nhật ký: backend/src/search/*, test liên quan search/books/carts, DTO/test auth và tài liệu audit. Git commit không tự chứng minh tỷ lệ code do AI sinh; nhóm phải xác nhận mức sử dụng thực tế trước khi nộp.</w:t>
+        <w:t xml:space="preserve">Tra cứu backend/docs/AI_DISCLOSURE.md để ghi rõ người thực hiện Viet đã dùng Claude trong DTO/Pipe, Meilisearch, sách/giỏ và phần kiểm thử; Codex hỗ trợ đối chiếu rubric, sửa mã và kiểm chứng runtime ngày 19–20/10. Khi hoàn thiện lời khai, xác nhận lại mức sử dụng AI thực tế của từng thành viên; Git commit không xác định được tỷ lệ mã do AI sinh. Đối chiếu đặc biệt các vùng backend/src/search/*, test search/books/carts, DTO/test auth và tài liệu audit.</w:t>
       </w:r>
     </w:p>
     <w:tbl>
@@ -30714,7 +30714,7 @@
         <w:pStyle w:val="Normal"/>
       </w:pPr>
       <w:r>
-        <w:t xml:space="preserve">Nhật ký có thêm trường hợp AI đặt unit spec trong test/ thay vì cạnh source, đã chuyển sang src/user/dto và src/auth/dto. Hai prompt ở bảng là tóm tắt đầu vào còn lưu, không phải trích nguyên văn; bản chụp hội thoại cần nhóm bổ sung nếu rubric đòi prompt gốc. Không có tài liệu tự đánh giá từng thành viên về khả năng viết lại khi không dùng AI, nên báo cáo không tự nhận thay nhóm. Từ mã/test hiện có, các phần cần nhóm tự giải thích và sửa tại chỗ là Module/DI, transaction đơn hàng, Guard/ownership và retry search.</w:t>
+        <w:t xml:space="preserve">Trước khi nộp AI Disclosure, chuyển các prompt tóm tắt trong bảng thành trích dẫn nguyên văn hoặc đính kèm ảnh hội thoại nếu rubric yêu cầu. Kiểm tra lại trường hợp unit spec đã được chuyển từ test/ sang src/user/dto và src/auth/dto. Mỗi thành viên tự xác nhận phần có thể giải thích và sửa khi không dùng AI, đặc biệt Module/DI, transaction đơn hàng, Guard/ownership và retry search.</w:t>
       </w:r>
     </w:p>
     <w:p>
@@ -30738,7 +30738,7 @@
         <w:pStyle w:val="Normal"/>
       </w:pPr>
       <w:r>
-        <w:t xml:space="preserve">Ưu tiên mở rộng E2E trình duyệt cho luồng mua hàng, đưa E2E vào CI với database cô lập và bổ sung quan sát outbox/DLQ, cảnh báo khi BookSearchSync retry lâu. Với dữ liệu production, cần sao lưu, xem migration rồi áp có kiểm soát; mất toàn bộ index hoặc sửa DB ngoài API cần reindex. Các phép thử bảo mật hiện là review mã và HTTP E2E, nên có thể tiếp tục pentest trong môi trường được phép. Nếu cần so sánh Express, triển khai cùng API/dataset/cấu hình rồi đo; không suy luận từ bảng kiến trúc.</w:t>
+        <w:t xml:space="preserve">Để mở rộng sản phẩm, thêm E2E trình duyệt cho luồng mua hàng, đưa E2E vào CI với database cô lập và giám sát outbox/DLQ cùng thời gian retry của BookSearchSync. Trước khi dùng dữ liệu production, sao lưu, xem migration và áp có kiểm soát; khi mất index hoặc sửa DB ngoài API, chạy reindex. Thực hiện pentest trong môi trường được phép. Muốn so sánh Express, dùng cùng API, dataset và cấu hình rồi đo.</w:t>
       </w:r>
     </w:p>
     <w:p>
@@ -30754,7 +30754,7 @@
         <w:pStyle w:val="Normal"/>
       </w:pPr>
       <w:r>
-        <w:t xml:space="preserve">Nhóm nên luyện giải thích và sửa trực tiếp DI, ValidationPipe, Guard, transaction, outbox/idempotency và cache invalidation khi không dùng AI; đo thêm latency p50/p95 theo tải cố định và theo dõi khả năng phục hồi của search/broker. Đây là đề xuất học tập, không phải cam kết tính năng đã hoàn thành.</w:t>
+        <w:t xml:space="preserve">Luyện giải thích và sửa trực tiếp DI, ValidationPipe, Guard, transaction, outbox/idempotency và cache invalidation khi không dùng AI. Đo latency p50/p95 dưới tải cố định và thử khả năng phục hồi search/broker; ghi điều kiện đo để có thể lặp lại kết quả.</w:t>
       </w:r>
     </w:p>
     <w:p>
@@ -30970,7 +30970,7 @@
         <w:pStyle w:val="Normal"/>
       </w:pPr>
       <w:r>
-        <w:t xml:space="preserve">Bảng tổng hợp chỉ dùng mốc Git và tài liệu có thể kiểm tra. Repository không lưu file theo dõi 12 tuần, lịch tuần học hoặc phân công đầy đủ; vì vậy cột Tuần chưa thể gán số chính xác. Khi nhóm bổ sung weekly log, cần đối chiếu ngày và nội dung với commit trước khi nộp.</w:t>
+        <w:t xml:space="preserve">Khi hoàn thiện nhật ký 12 tuần, điền số tuần và người phụ trách từ weekly log đã được nhóm xác nhận; đối chiếu ngày, nội dung và commit trước khi nộp. Bảng hiện chỉ ghi các mốc Git có thể kiểm tra, vì repository chưa lưu lịch tuần học, phân công và nhật ký đầy đủ.</w:t>
       </w:r>
     </w:p>
     <w:tbl>
@@ -31484,7 +31484,7 @@
         <w:pStyle w:val="Normal"/>
       </w:pPr>
       <w:r>
-        <w:t xml:space="preserve">Repository: https://github.com/Thuat3Tuoi/book_selling_system. PR #12 có review chéo của vennnguyen trên SHA bb7593c, hai job CI qua và merge vào main; PR #13 chỉ cập nhật tài liệu, hiện mở để review. Git log thể hiện đóng góp theo tên tác giả, nhưng tên Git không đủ để xác nhận MSSV hoặc tỷ lệ đóng góp. Chưa có ảnh chụp Insights/Contributors và ảnh 10–20 commit gần nhất trong tài liệu hiện có; nhóm cần bổ sung khi nộp.</w:t>
+        <w:t xml:space="preserve">Để hoàn thiện minh chứng nhóm, đính kèm PR #12 và review của vennnguyen trên SHA bb7593c, hai job CI thành công, Git log, ảnh Insights/Contributors và ảnh 10–20 commit gần nhất. PR #13 là nhánh cập nhật tài liệu cần được kiểm tra trạng thái trước khi nộp. Dùng hồ sơ nhóm để xác nhận MSSV và tỷ lệ đóng góp; tên tác giả Git không đủ cho bước này.</w:t>
       </w:r>
     </w:p>
     <w:tbl>
@@ -32174,7 +32174,7 @@
               <w:rPr>
                 <w:sz w:val="17"/>
               </w:rPr>
-              <w:t xml:space="preserve">D1–D8 có bằng chứng theo audit; E2E riêng, chưa pentest; AI Disclosure cần nhóm xác nhận lời khai</w:t>
+              <w:t xml:space="preserve">Đối chiếu D1–D8 bằng audit; chạy E2E riêng; bổ sung pentest và xác nhận lời khai AI Disclosure trước khi nộp.</w:t>
             </w:r>
           </w:p>
         </w:tc>

</xml_diff>